<commit_message>
7부 4화 Price War 대본 추가 (2화 docx 재생성)
Co-Authored-By: Claude Opus 5.5 <noreply@anthropic.com>
Claude-Session: https://claude.ai/code/session_01N4vhCLeYxrjvGnDxQBD9Cq
</commit_message>
<xml_diff>
--- a/대본/7부/02화_The_Big_Booth.docx
+++ b/대본/7부/02화_The_Big_Booth.docx
@@ -47,7 +47,7 @@
         <w:t xml:space="preserve"> </w:t>
       </w:r>
       <w:r>
-        <w:t xml:space="preserve">- 등장인물: Noah, Zoe, Grace, Elena, Priya, Kim Ha-eun(Veyra Korea 1호 영업 담당), Dr. Choi Min-jun(서울 피부과 전문의, 시연 연자), Yoon Ji-woo(강남 간호사, 카드 다운로드 50만 번째), 박정호(서린바이오 대표), 이수진(서린바이오 해외사업 팀장), 한서연(대양바이오 신사업 상무), Bellacare 부스 직원</w:t>
+        <w:t xml:space="preserve">- 등장인물: Noah, Zoe, Grace, Elena, Priya, Kim Ha-eun(Veyra Korea 1호 영업 담당), Dr. Choi Min-jun(서울 피부과 전문의, 시연 연자), Yoon Ji-woo(강남 간호사, 카드 다운로드 50만 번째), 박정호(서린바이오 대표), 이수진(서린바이오 QA 팀장), 한서연(대양바이오 신사업 상무), Bellacare 부스 직원</w:t>
       </w:r>
       <w:r>
         <w:t xml:space="preserve"> </w:t>
@@ -1851,7 +1851,7 @@
         <w:t xml:space="preserve"> </w:t>
       </w:r>
       <w:r>
-        <w:t xml:space="preserve">박정호: 먼저 전화하셨죠. 1월에. 다른 누구보다 먼저. 저는 그런 걸 기억합니다.</w:t>
+        <w:t xml:space="preserve">박 대표: 먼저 전화하셨죠. 1월에. 다른 누구보다 먼저. 저는 그런 걸 기억합니다.</w:t>
       </w:r>
     </w:p>
     <w:p>
@@ -1902,7 +1902,7 @@
         <w:t xml:space="preserve"> </w:t>
       </w:r>
       <w:r>
-        <w:t xml:space="preserve">박정호: 베넷 대표님. 내일 대양이 부스에 올 겁니다. 한 상무가요.</w:t>
+        <w:t xml:space="preserve">박 대표: 베넷 대표님. 내일 대양이 부스에 올 겁니다. 한 상무가요.</w:t>
       </w:r>
     </w:p>
     <w:p>
@@ -1936,7 +1936,7 @@
         <w:t xml:space="preserve"> </w:t>
       </w:r>
       <w:r>
-        <w:t xml:space="preserve">박정호: 한국은 좁습니다. 그리고 그분이 말해 줬어요. 어제. 정중하게.</w:t>
+        <w:t xml:space="preserve">박 대표: 한국은 좁습니다. 그리고 그분이 말해 줬어요. 어제. 정중하게.</w:t>
       </w:r>
     </w:p>
     <w:p>
@@ -1970,7 +1970,7 @@
         <w:t xml:space="preserve"> </w:t>
       </w:r>
       <w:r>
-        <w:t xml:space="preserve">박정호: 잘 들으세요. 아무것도 약속하지 말고요. 그다음 오창으로 오세요. 제대로 얘기합시다. 저녁 먹으면서.</w:t>
+        <w:t xml:space="preserve">박 대표: 잘 들으세요. 아무것도 약속하지 말고요. 그다음 오창으로 오세요. 제대로 얘기합시다. 저녁 먹으면서.</w:t>
       </w:r>
     </w:p>
     <w:p>

</xml_diff>